<commit_message>
docs: align Semana 12 JPA materials
Add progressive Jugador exercises and organize the six exercise tabs. Synchronize the weekly HTML materials and official Markdown/DOCX documents.

Co-authored-by: Copilot <223556219+Copilot@users.noreply.github.com>
</commit_message>
<xml_diff>
--- a/PEM en TIC_Guía de Aprendizaje 12 Programación 1_18_semanas.docx
+++ b/PEM en TIC_Guía de Aprendizaje 12 Programación 1_18_semanas.docx
@@ -961,22 +961,25 @@
         <w:tblLook w:firstRow="1" w:lastRow="0" w:firstColumn="0" w:lastColumn="0" w:noHBand="0" w:noVBand="0" w:val="0020"/>
       </w:tblPr>
       <w:tblGrid>
-        <w:gridCol w:w="7920"/>
+        <w:gridCol w:w="7811"/>
+        <w:gridCol w:w="108"/>
       </w:tblGrid>
       <w:tr>
         <w:trPr>
           <w:tblHeader w:val="on"/>
         </w:trPr>
         <w:tc>
-          <w:tcPr/>
+          <w:tcPr>
+            <w:gridSpan w:val="2"/>
+          </w:tcPr>
           <w:p>
             <w:pPr>
-              <w:pStyle w:val="FirstParagraph"/>
+              <w:pStyle w:val="Compact"/>
             </w:pPr>
             <w:r>
               <w:drawing>
                 <wp:inline>
-                  <wp:extent cx="447675" cy="447675"/>
+                  <wp:extent cx="2464067" cy="2464067"/>
                   <wp:effectExtent b="0" l="0" r="0" t="0"/>
                   <wp:docPr descr="Libros" title="" id="20" name="Picture"/>
                   <a:graphic>
@@ -997,7 +1000,7 @@
                         <pic:spPr bwMode="auto">
                           <a:xfrm>
                             <a:off x="0" y="0"/>
-                            <a:ext cx="447675" cy="447675"/>
+                            <a:ext cx="2464067" cy="2464067"/>
                           </a:xfrm>
                           <a:prstGeom prst="rect">
                             <a:avLst/>
@@ -1016,11 +1019,35 @@
               </w:drawing>
             </w:r>
             <w:r>
+              <w:t xml:space="preserve">{width=</w:t>
+            </w:r>
+            <w:r>
+              <w:t xml:space="preserve">“0.4895833333333333in”</w:t>
+            </w:r>
+            <w:r>
+              <w:t xml:space="preserve"> </w:t>
+            </w:r>
+            <w:r>
+              <w:t xml:space="preserve">|</w:t>
+            </w:r>
+            <w:r>
+              <w:t xml:space="preserve"> </w:t>
+            </w:r>
+            <w:r>
+              <w:t xml:space="preserve">height=</w:t>
+            </w:r>
+            <w:r>
+              <w:t xml:space="preserve">“0.4895833333333333in”</w:t>
+            </w:r>
+            <w:r>
+              <w:t xml:space="preserve">}</w:t>
+            </w:r>
+            <w:r>
               <w:rPr>
                 <w:b/>
                 <w:bCs/>
               </w:rPr>
-              <w:t xml:space="preserve">PRIMERA PARTE: REFUERZO DE</w:t>
+              <w:t xml:space="preserve">PRIMERA PARTE: REFUERZO DE |</w:t>
             </w:r>
             <w:r>
               <w:rPr>
@@ -1036,11 +1063,21 @@
               </w:rPr>
               <w:t xml:space="preserve">APRENDIZAJES</w:t>
             </w:r>
-          </w:p>
-          <w:p>
-            <w:pPr>
-              <w:pStyle w:val="BodyText"/>
-            </w:pPr>
+            <w:r>
+              <w:t xml:space="preserve"> </w:t>
+            </w:r>
+            <w:r>
+              <w:t xml:space="preserve">|</w:t>
+            </w:r>
+            <w:r>
+              <w:t xml:space="preserve"> </w:t>
+            </w:r>
+            <w:r>
+              <w:t xml:space="preserve">|</w:t>
+            </w:r>
+            <w:r>
+              <w:t xml:space="preserve"> </w:t>
+            </w:r>
             <w:r>
               <w:rPr>
                 <w:b/>
@@ -1052,25 +1089,29 @@
               <w:t xml:space="preserve"> </w:t>
             </w:r>
             <w:r>
-              <w:t xml:space="preserve">Consolidar el mapeo de objetos a</w:t>
-            </w:r>
-            <w:r>
-              <w:t xml:space="preserve"> </w:t>
-            </w:r>
-            <w:r>
-              <w:t xml:space="preserve">tablas y el uso de repositorios, practicando primero sobre un</w:t>
-            </w:r>
-            <w:r>
-              <w:t xml:space="preserve"> </w:t>
-            </w:r>
-            <w:r>
-              <w:t xml:space="preserve">proyecto desechable antes de tocar el proyecto real.</w:t>
-            </w:r>
-          </w:p>
-          <w:p>
-            <w:pPr>
-              <w:pStyle w:val="BodyText"/>
-            </w:pPr>
+              <w:t xml:space="preserve">Consolidar el mapeo de objetos a |</w:t>
+            </w:r>
+            <w:r>
+              <w:t xml:space="preserve"> </w:t>
+            </w:r>
+            <w:r>
+              <w:t xml:space="preserve">tablas y el uso de repositorios, continuando el módulo validado de |</w:t>
+            </w:r>
+            <w:r>
+              <w:t xml:space="preserve"> </w:t>
+            </w:r>
+            <w:r>
+              <w:t xml:space="preserve">Semana 11 antes de transferirlo a otro dominio. |</w:t>
+            </w:r>
+            <w:r>
+              <w:t xml:space="preserve"> </w:t>
+            </w:r>
+            <w:r>
+              <w:t xml:space="preserve">|</w:t>
+            </w:r>
+            <w:r>
+              <w:t xml:space="preserve"> </w:t>
+            </w:r>
             <w:r>
               <w:rPr>
                 <w:b/>
@@ -1078,15 +1119,27 @@
               </w:rPr>
               <w:t xml:space="preserve">Actividades (Instrucciones):</w:t>
             </w:r>
-          </w:p>
-          <w:p>
-            <w:pPr>
-              <w:pStyle w:val="Compact"/>
-              <w:numPr>
-                <w:ilvl w:val="0"/>
-                <w:numId w:val="1001"/>
-              </w:numPr>
-            </w:pPr>
+            <w:r>
+              <w:t xml:space="preserve"> </w:t>
+            </w:r>
+            <w:r>
+              <w:t xml:space="preserve">|</w:t>
+            </w:r>
+            <w:r>
+              <w:t xml:space="preserve"> </w:t>
+            </w:r>
+            <w:r>
+              <w:t xml:space="preserve">|</w:t>
+            </w:r>
+            <w:r>
+              <w:t xml:space="preserve"> </w:t>
+            </w:r>
+            <w:r>
+              <w:t xml:space="preserve">1.</w:t>
+            </w:r>
+            <w:r>
+              <w:t xml:space="preserve"> </w:t>
+            </w:r>
             <w:r>
               <w:rPr>
                 <w:b/>
@@ -1094,47 +1147,47 @@
               </w:rPr>
               <w:t xml:space="preserve">Repaso interactivo:</w:t>
             </w:r>
-          </w:p>
-          <w:p>
-            <w:pPr>
-              <w:pStyle w:val="Compact"/>
-              <w:numPr>
-                <w:ilvl w:val="1"/>
-                <w:numId w:val="1002"/>
-              </w:numPr>
-            </w:pPr>
-            <w:r>
-              <w:t xml:space="preserve">Estudiar las dos pestañas del cheat sheet</w:t>
-            </w:r>
-            <w:r>
-              <w:t xml:space="preserve"> </w:t>
-            </w:r>
-            <w:r>
-              <w:t xml:space="preserve">(</w:t>
+            <w:r>
+              <w:t xml:space="preserve"> </w:t>
+            </w:r>
+            <w:r>
+              <w:t xml:space="preserve">|</w:t>
+            </w:r>
+            <w:r>
+              <w:t xml:space="preserve"> </w:t>
+            </w:r>
+            <w:r>
+              <w:t xml:space="preserve">- Estudiar las pestañas de</w:t>
+            </w:r>
+            <w:r>
+              <w:t xml:space="preserve"> </w:t>
             </w:r>
             <w:r>
               <w:rPr>
                 <w:rStyle w:val="VerbatimChar"/>
               </w:rPr>
-              <w:t xml:space="preserve">Material_Sesion_Clase_12_HTML_18_semanas/cheatsheet.html</w:t>
-            </w:r>
-            <w:r>
-              <w:t xml:space="preserve">):</w:t>
-            </w:r>
-            <w:r>
-              <w:t xml:space="preserve"> </w:t>
-            </w:r>
-            <w:r>
-              <w:t xml:space="preserve">“Conceptos JPA”</w:t>
-            </w:r>
-            <w:r>
-              <w:t xml:space="preserve">, con la tabla de anotaciones y su import</w:t>
-            </w:r>
-            <w:r>
-              <w:t xml:space="preserve"> </w:t>
-            </w:r>
-            <w:r>
-              <w:t xml:space="preserve">completo, los métodos que ya trae</w:t>
+              <w:t xml:space="preserve">cheatsheet.html</w:t>
+            </w:r>
+            <w:r>
+              <w:t xml:space="preserve">:</w:t>
+            </w:r>
+            <w:r>
+              <w:t xml:space="preserve"> </w:t>
+            </w:r>
+            <w:r>
+              <w:t xml:space="preserve">“Continuidad: |</w:t>
+            </w:r>
+            <w:r>
+              <w:t xml:space="preserve"> </w:t>
+            </w:r>
+            <w:r>
+              <w:t xml:space="preserve">Jugador”</w:t>
+            </w:r>
+            <w:r>
+              <w:t xml:space="preserve"> </w:t>
+            </w:r>
+            <w:r>
+              <w:t xml:space="preserve">aplica las anotaciones y repositorio al mismo |</w:t>
             </w:r>
             <w:r>
               <w:t xml:space="preserve"> </w:t>
@@ -1143,19 +1196,13 @@
               <w:rPr>
                 <w:rStyle w:val="VerbatimChar"/>
               </w:rPr>
-              <w:t xml:space="preserve">JpaRepository</w:t>
-            </w:r>
-            <w:r>
-              <w:t xml:space="preserve"> </w:t>
-            </w:r>
-            <w:r>
-              <w:t xml:space="preserve">y el</w:t>
-            </w:r>
-            <w:r>
-              <w:t xml:space="preserve"> </w:t>
-            </w:r>
-            <w:r>
-              <w:t xml:space="preserve">catálogo de errores frecuentes; y</w:t>
+              <w:t xml:space="preserve">taller-formularios</w:t>
+            </w:r>
+            <w:r>
+              <w:t xml:space="preserve"> </w:t>
+            </w:r>
+            <w:r>
+              <w:t xml:space="preserve">de la Semana 11;</w:t>
             </w:r>
             <w:r>
               <w:t xml:space="preserve"> </w:t>
@@ -1164,25 +1211,34 @@
               <w:t xml:space="preserve">“De H2 a Neon”</w:t>
             </w:r>
             <w:r>
-              <w:t xml:space="preserve">, con la tabla</w:t>
-            </w:r>
-            <w:r>
-              <w:t xml:space="preserve"> </w:t>
-            </w:r>
-            <w:r>
-              <w:t xml:space="preserve">comparativa entre la base local y la de producción.</w:t>
-            </w:r>
-          </w:p>
-          <w:p>
-            <w:pPr>
-              <w:pStyle w:val="Compact"/>
-              <w:numPr>
-                <w:ilvl w:val="1"/>
-                <w:numId w:val="1002"/>
-              </w:numPr>
-            </w:pPr>
-            <w:r>
-              <w:t xml:space="preserve">Resolver los ocho ejercicios en escalera de</w:t>
+              <w:t xml:space="preserve"> </w:t>
+            </w:r>
+            <w:r>
+              <w:t xml:space="preserve">anticipa |</w:t>
+            </w:r>
+            <w:r>
+              <w:t xml:space="preserve"> </w:t>
+            </w:r>
+            <w:r>
+              <w:t xml:space="preserve">la configuración de producción. La pestaña adicional |</w:t>
+            </w:r>
+            <w:r>
+              <w:t xml:space="preserve"> </w:t>
+            </w:r>
+            <w:r>
+              <w:t xml:space="preserve">“Referencia: taller-jpa (Libro)”</w:t>
+            </w:r>
+            <w:r>
+              <w:t xml:space="preserve"> </w:t>
+            </w:r>
+            <w:r>
+              <w:t xml:space="preserve">es un ejemplo completo aparte. |</w:t>
+            </w:r>
+            <w:r>
+              <w:t xml:space="preserve"> </w:t>
+            </w:r>
+            <w:r>
+              <w:t xml:space="preserve">- En</w:t>
             </w:r>
             <w:r>
               <w:t xml:space="preserve"> </w:t>
@@ -1194,10 +1250,46 @@
               <w:t xml:space="preserve">ejercicios.html</w:t>
             </w:r>
             <w:r>
-              <w:t xml:space="preserve"> </w:t>
-            </w:r>
-            <w:r>
-              <w:t xml:space="preserve">con el proyecto de práctica</w:t>
+              <w:t xml:space="preserve">, resolver primero</w:t>
+            </w:r>
+            <w:r>
+              <w:t xml:space="preserve"> </w:t>
+            </w:r>
+            <w:r>
+              <w:t xml:space="preserve">“Ejercicios”</w:t>
+            </w:r>
+            <w:r>
+              <w:t xml:space="preserve">, siguiendo |</w:t>
+            </w:r>
+            <w:r>
+              <w:t xml:space="preserve"> </w:t>
+            </w:r>
+            <w:r>
+              <w:t xml:space="preserve">sus checkpoints. Usar después el</w:t>
+            </w:r>
+            <w:r>
+              <w:t xml:space="preserve"> </w:t>
+            </w:r>
+            <w:r>
+              <w:t xml:space="preserve">“Kit de Acompañamiento de |</w:t>
+            </w:r>
+            <w:r>
+              <w:t xml:space="preserve"> </w:t>
+            </w:r>
+            <w:r>
+              <w:t xml:space="preserve">Ejercicios”</w:t>
+            </w:r>
+            <w:r>
+              <w:t xml:space="preserve"> </w:t>
+            </w:r>
+            <w:r>
+              <w:t xml:space="preserve">para consultar los archivos finales y su explicación.</w:t>
+            </w:r>
+            <w:r>
+              <w:t xml:space="preserve"> </w:t>
+            </w:r>
+            <w:r>
+              <w:t xml:space="preserve">Quienes ya completaron Semana 11 continúan con</w:t>
             </w:r>
             <w:r>
               <w:t xml:space="preserve"> </w:t>
@@ -1206,19 +1298,100 @@
               <w:rPr>
                 <w:rStyle w:val="VerbatimChar"/>
               </w:rPr>
+              <w:t xml:space="preserve">Jugador</w:t>
+            </w:r>
+            <w:r>
+              <w:t xml:space="preserve">, |</w:t>
+            </w:r>
+            <w:r>
+              <w:t xml:space="preserve"> </w:t>
+            </w:r>
+            <w:r>
+              <w:t xml:space="preserve">conservando el formulario y sus validaciones mientras</w:t>
+            </w:r>
+            <w:r>
+              <w:t xml:space="preserve"> </w:t>
+            </w:r>
+            <w:r>
+              <w:t xml:space="preserve">reemplazan</w:t>
+            </w:r>
+            <w:r>
+              <w:t xml:space="preserve"> </w:t>
+            </w:r>
+            <w:r>
+              <w:rPr>
+                <w:rStyle w:val="VerbatimChar"/>
+              </w:rPr>
+              <w:t xml:space="preserve">List&lt;Jugador&gt;</w:t>
+            </w:r>
+            <w:r>
+              <w:t xml:space="preserve"> </w:t>
+            </w:r>
+            <w:r>
+              <w:t xml:space="preserve">por JPA. Quienes aún no llegaron a</w:t>
+            </w:r>
+            <w:r>
+              <w:t xml:space="preserve"> </w:t>
+            </w:r>
+            <w:r>
+              <w:t xml:space="preserve">Semana 11 usan el Kit para iniciar Jugador desde cero: generan |</w:t>
+            </w:r>
+            <w:r>
+              <w:t xml:space="preserve"> </w:t>
+            </w:r>
+            <w:r>
+              <w:t xml:space="preserve">el proyecto en Spring Initializr, seleccionan allí las |</w:t>
+            </w:r>
+            <w:r>
+              <w:t xml:space="preserve"> </w:t>
+            </w:r>
+            <w:r>
+              <w:t xml:space="preserve">dependencias y siguen el árbol completo de archivos. Ambos |</w:t>
+            </w:r>
+            <w:r>
+              <w:t xml:space="preserve"> </w:t>
+            </w:r>
+            <w:r>
+              <w:t xml:space="preserve">recorridos incluyen validación, persistencia y |</w:t>
+            </w:r>
+            <w:r>
+              <w:t xml:space="preserve"> </w:t>
+            </w:r>
+            <w:r>
+              <w:rPr>
+                <w:rStyle w:val="VerbatimChar"/>
+              </w:rPr>
+              <w:t xml:space="preserve">templates/error.html</w:t>
+            </w:r>
+            <w:r>
+              <w:t xml:space="preserve">. Después, la Práctica independiente de |</w:t>
+            </w:r>
+            <w:r>
+              <w:t xml:space="preserve"> </w:t>
+            </w:r>
+            <w:r>
+              <w:t xml:space="preserve">Biblioteca y el Anexo</w:t>
+            </w:r>
+            <w:r>
+              <w:t xml:space="preserve"> </w:t>
+            </w:r>
+            <w:r>
+              <w:rPr>
+                <w:rStyle w:val="VerbatimChar"/>
+              </w:rPr>
               <w:t xml:space="preserve">taller-jpa</w:t>
             </w:r>
             <w:r>
               <w:t xml:space="preserve"> </w:t>
             </w:r>
             <w:r>
-              <w:t xml:space="preserve">(Biblioteca</w:t>
-            </w:r>
-            <w:r>
-              <w:t xml:space="preserve"> </w:t>
-            </w:r>
-            <w:r>
-              <w:t xml:space="preserve">Comunitaria Semilla, entidad</w:t>
+              <w:t xml:space="preserve">transfieren lo aprendido. El |</w:t>
+            </w:r>
+            <w:r>
+              <w:t xml:space="preserve"> </w:t>
+            </w:r>
+            <w:r>
+              <w:t xml:space="preserve">paso final de H2 en archivo, perfiles</w:t>
             </w:r>
             <w:r>
               <w:t xml:space="preserve"> </w:t>
@@ -1227,22 +1400,94 @@
               <w:rPr>
                 <w:rStyle w:val="VerbatimChar"/>
               </w:rPr>
-              <w:t xml:space="preserve">Libro</w:t>
-            </w:r>
-            <w:r>
-              <w:t xml:space="preserve">). El Ejercicio 4 muestra</w:t>
-            </w:r>
-            <w:r>
-              <w:t xml:space="preserve"> </w:t>
-            </w:r>
-            <w:r>
-              <w:t xml:space="preserve">con las propias manos el problema —la base en memoria olvida—</w:t>
-            </w:r>
-            <w:r>
-              <w:t xml:space="preserve"> </w:t>
-            </w:r>
-            <w:r>
-              <w:t xml:space="preserve">y el</w:t>
+              <w:t xml:space="preserve">dev</w:t>
+            </w:r>
+            <w:r>
+              <w:t xml:space="preserve"> </w:t>
+            </w:r>
+            <w:r>
+              <w:t xml:space="preserve">y</w:t>
+            </w:r>
+            <w:r>
+              <w:t xml:space="preserve"> </w:t>
+            </w:r>
+            <w:r>
+              <w:rPr>
+                <w:rStyle w:val="VerbatimChar"/>
+              </w:rPr>
+              <w:t xml:space="preserve">prod</w:t>
+            </w:r>
+            <w:r>
+              <w:t xml:space="preserve">, y</w:t>
+            </w:r>
+            <w:r>
+              <w:t xml:space="preserve"> </w:t>
+            </w:r>
+            <w:r>
+              <w:rPr>
+                <w:rStyle w:val="VerbatimChar"/>
+              </w:rPr>
+              <w:t xml:space="preserve">.gitignore</w:t>
+            </w:r>
+            <w:r>
+              <w:t xml:space="preserve"> </w:t>
+            </w:r>
+            <w:r>
+              <w:t xml:space="preserve">es obligatorio.</w:t>
+            </w:r>
+            <w:r>
+              <w:t xml:space="preserve"> </w:t>
+            </w:r>
+            <w:r>
+              <w:t xml:space="preserve">- Completar ambas pestañas del challenge si no se terminaron en |</w:t>
+            </w:r>
+            <w:r>
+              <w:t xml:space="preserve"> </w:t>
+            </w:r>
+            <w:r>
+              <w:t xml:space="preserve">clase, en especial el simulador que compara la base en memoria |</w:t>
+            </w:r>
+            <w:r>
+              <w:t xml:space="preserve"> </w:t>
+            </w:r>
+            <w:r>
+              <w:t xml:space="preserve">con la base en archivo. |</w:t>
+            </w:r>
+            <w:r>
+              <w:t xml:space="preserve"> </w:t>
+            </w:r>
+            <w:r>
+              <w:t xml:space="preserve">- Repetir el Quiz en modo Final con el botón</w:t>
+            </w:r>
+            <w:r>
+              <w:t xml:space="preserve"> </w:t>
+            </w:r>
+            <w:r>
+              <w:t xml:space="preserve">“🔀 Nuevas |</w:t>
+            </w:r>
+            <w:r>
+              <w:t xml:space="preserve"> </w:t>
+            </w:r>
+            <w:r>
+              <w:t xml:space="preserve">preguntas”</w:t>
+            </w:r>
+            <w:r>
+              <w:t xml:space="preserve"> </w:t>
+            </w:r>
+            <w:r>
+              <w:t xml:space="preserve">como autoevaluación de estudio. |</w:t>
+            </w:r>
+            <w:r>
+              <w:t xml:space="preserve"> </w:t>
+            </w:r>
+            <w:r>
+              <w:t xml:space="preserve">|</w:t>
+            </w:r>
+            <w:r>
+              <w:t xml:space="preserve"> </w:t>
+            </w:r>
+            <w:r>
+              <w:t xml:space="preserve">2.</w:t>
             </w:r>
             <w:r>
               <w:t xml:space="preserve"> </w:t>
@@ -1252,16 +1497,25 @@
                 <w:b/>
                 <w:bCs/>
               </w:rPr>
-              <w:t xml:space="preserve">Ejercicio 8 es el imprescindible</w:t>
-            </w:r>
-            <w:r>
-              <w:t xml:space="preserve">: H2 en archivo,</w:t>
-            </w:r>
-            <w:r>
-              <w:t xml:space="preserve"> </w:t>
-            </w:r>
-            <w:r>
-              <w:t xml:space="preserve">perfiles</w:t>
+              <w:t xml:space="preserve">Investigación breve:</w:t>
+            </w:r>
+            <w:r>
+              <w:t xml:space="preserve"> </w:t>
+            </w:r>
+            <w:r>
+              <w:t xml:space="preserve">|</w:t>
+            </w:r>
+            <w:r>
+              <w:t xml:space="preserve"> </w:t>
+            </w:r>
+            <w:r>
+              <w:t xml:space="preserve">- Investigar qué otras estrategias de generación de |</w:t>
+            </w:r>
+            <w:r>
+              <w:t xml:space="preserve"> </w:t>
+            </w:r>
+            <w:r>
+              <w:t xml:space="preserve">identificadores existen además de</w:t>
             </w:r>
             <w:r>
               <w:t xml:space="preserve"> </w:t>
@@ -1270,7 +1524,22 @@
               <w:rPr>
                 <w:rStyle w:val="VerbatimChar"/>
               </w:rPr>
-              <w:t xml:space="preserve">dev</w:t>
+              <w:t xml:space="preserve">IDENTITY</w:t>
+            </w:r>
+            <w:r>
+              <w:t xml:space="preserve"> </w:t>
+            </w:r>
+            <w:r>
+              <w:t xml:space="preserve">(por ejemplo |</w:t>
+            </w:r>
+            <w:r>
+              <w:t xml:space="preserve"> </w:t>
+            </w:r>
+            <w:r>
+              <w:rPr>
+                <w:rStyle w:val="VerbatimChar"/>
+              </w:rPr>
+              <w:t xml:space="preserve">SEQUENCE</w:t>
             </w:r>
             <w:r>
               <w:t xml:space="preserve"> </w:t>
@@ -1285,10 +1554,10 @@
               <w:rPr>
                 <w:rStyle w:val="VerbatimChar"/>
               </w:rPr>
-              <w:t xml:space="preserve">prod</w:t>
-            </w:r>
-            <w:r>
-              <w:t xml:space="preserve">, y la carpeta de datos en</w:t>
+              <w:t xml:space="preserve">AUTO</w:t>
+            </w:r>
+            <w:r>
+              <w:t xml:space="preserve">) y por qué en este curso se eligió |</w:t>
             </w:r>
             <w:r>
               <w:t xml:space="preserve"> </w:t>
@@ -1297,176 +1566,50 @@
               <w:rPr>
                 <w:rStyle w:val="VerbatimChar"/>
               </w:rPr>
-              <w:t xml:space="preserve">.gitignore</w:t>
-            </w:r>
-            <w:r>
-              <w:t xml:space="preserve">.</w:t>
-            </w:r>
-          </w:p>
-          <w:p>
-            <w:pPr>
-              <w:pStyle w:val="Compact"/>
-              <w:numPr>
-                <w:ilvl w:val="1"/>
-                <w:numId w:val="1002"/>
-              </w:numPr>
-            </w:pPr>
-            <w:r>
-              <w:t xml:space="preserve">Completar ambas pestañas del challenge si no se terminaron en</w:t>
-            </w:r>
-            <w:r>
-              <w:t xml:space="preserve"> </w:t>
-            </w:r>
-            <w:r>
-              <w:t xml:space="preserve">clase, en especial el simulador que compara la base en memoria</w:t>
-            </w:r>
-            <w:r>
-              <w:t xml:space="preserve"> </w:t>
-            </w:r>
-            <w:r>
-              <w:t xml:space="preserve">con la base en archivo.</w:t>
-            </w:r>
-          </w:p>
-          <w:p>
-            <w:pPr>
-              <w:pStyle w:val="Compact"/>
-              <w:numPr>
-                <w:ilvl w:val="1"/>
-                <w:numId w:val="1002"/>
-              </w:numPr>
-            </w:pPr>
-            <w:r>
-              <w:t xml:space="preserve">Repetir el Quiz en modo Final con el botón</w:t>
-            </w:r>
-            <w:r>
-              <w:t xml:space="preserve"> </w:t>
-            </w:r>
-            <w:r>
-              <w:t xml:space="preserve">“🔀 Nuevas</w:t>
-            </w:r>
-            <w:r>
-              <w:t xml:space="preserve"> </w:t>
-            </w:r>
-            <w:r>
-              <w:t xml:space="preserve">preguntas”</w:t>
-            </w:r>
-            <w:r>
-              <w:t xml:space="preserve"> </w:t>
-            </w:r>
-            <w:r>
-              <w:t xml:space="preserve">como autoevaluación de estudio.</w:t>
-            </w:r>
-          </w:p>
-          <w:p>
-            <w:pPr>
-              <w:pStyle w:val="Compact"/>
-              <w:numPr>
-                <w:ilvl w:val="0"/>
-                <w:numId w:val="1001"/>
-              </w:numPr>
-            </w:pPr>
+              <w:t xml:space="preserve">IDENTITY</w:t>
+            </w:r>
+            <w:r>
+              <w:t xml:space="preserve">. |</w:t>
+            </w:r>
+            <w:r>
+              <w:t xml:space="preserve"> </w:t>
+            </w:r>
+            <w:r>
+              <w:t xml:space="preserve">- Investigar qué significa que una base de datos sea |</w:t>
+            </w:r>
+            <w:r>
+              <w:t xml:space="preserve"> </w:t>
+            </w:r>
+            <w:r>
+              <w:t xml:space="preserve">“relacional”</w:t>
+            </w:r>
+            <w:r>
+              <w:t xml:space="preserve"> </w:t>
+            </w:r>
+            <w:r>
+              <w:t xml:space="preserve">y qué diferencia hay entre una base</w:t>
+            </w:r>
+            <w:r>
+              <w:t xml:space="preserve"> </w:t>
+            </w:r>
             <w:r>
               <w:rPr>
                 <w:b/>
                 <w:bCs/>
               </w:rPr>
-              <w:t xml:space="preserve">Investigación breve:</w:t>
-            </w:r>
-          </w:p>
-          <w:p>
-            <w:pPr>
-              <w:pStyle w:val="Compact"/>
-              <w:numPr>
-                <w:ilvl w:val="1"/>
-                <w:numId w:val="1003"/>
-              </w:numPr>
-            </w:pPr>
-            <w:r>
-              <w:t xml:space="preserve">Investigar qué otras estrategias de generación de</w:t>
-            </w:r>
-            <w:r>
-              <w:t xml:space="preserve"> </w:t>
-            </w:r>
-            <w:r>
-              <w:t xml:space="preserve">identificadores existen además de</w:t>
-            </w:r>
-            <w:r>
-              <w:t xml:space="preserve"> </w:t>
-            </w:r>
-            <w:r>
-              <w:rPr>
-                <w:rStyle w:val="VerbatimChar"/>
-              </w:rPr>
-              <w:t xml:space="preserve">IDENTITY</w:t>
-            </w:r>
-            <w:r>
-              <w:t xml:space="preserve"> </w:t>
-            </w:r>
-            <w:r>
-              <w:t xml:space="preserve">(por ejemplo</w:t>
-            </w:r>
-            <w:r>
-              <w:t xml:space="preserve"> </w:t>
-            </w:r>
-            <w:r>
-              <w:rPr>
-                <w:rStyle w:val="VerbatimChar"/>
-              </w:rPr>
-              <w:t xml:space="preserve">SEQUENCE</w:t>
-            </w:r>
-            <w:r>
-              <w:t xml:space="preserve"> </w:t>
-            </w:r>
-            <w:r>
-              <w:t xml:space="preserve">y</w:t>
-            </w:r>
-            <w:r>
-              <w:t xml:space="preserve"> </w:t>
-            </w:r>
-            <w:r>
-              <w:rPr>
-                <w:rStyle w:val="VerbatimChar"/>
-              </w:rPr>
-              <w:t xml:space="preserve">AUTO</w:t>
-            </w:r>
-            <w:r>
-              <w:t xml:space="preserve">) y por qué en este curso se eligió</w:t>
-            </w:r>
-            <w:r>
-              <w:t xml:space="preserve"> </w:t>
-            </w:r>
-            <w:r>
-              <w:rPr>
-                <w:rStyle w:val="VerbatimChar"/>
-              </w:rPr>
-              <w:t xml:space="preserve">IDENTITY</w:t>
-            </w:r>
-            <w:r>
-              <w:t xml:space="preserve">.</w:t>
-            </w:r>
-          </w:p>
-          <w:p>
-            <w:pPr>
-              <w:pStyle w:val="Compact"/>
-              <w:numPr>
-                <w:ilvl w:val="1"/>
-                <w:numId w:val="1003"/>
-              </w:numPr>
-            </w:pPr>
-            <w:r>
-              <w:t xml:space="preserve">Investigar qué significa que una base de datos sea</w:t>
-            </w:r>
-            <w:r>
-              <w:t xml:space="preserve"> </w:t>
-            </w:r>
-            <w:r>
-              <w:t xml:space="preserve">“relacional”</w:t>
-            </w:r>
-            <w:r>
-              <w:t xml:space="preserve"> </w:t>
-            </w:r>
-            <w:r>
-              <w:t xml:space="preserve">y qué diferencia hay entre una base</w:t>
+              <w:t xml:space="preserve">en memoria</w:t>
+            </w:r>
+            <w:r>
+              <w:t xml:space="preserve"> </w:t>
+            </w:r>
+            <w:r>
+              <w:t xml:space="preserve">|</w:t>
+            </w:r>
+            <w:r>
+              <w:t xml:space="preserve"> </w:t>
+            </w:r>
+            <w:r>
+              <w:t xml:space="preserve">y una base</w:t>
             </w:r>
             <w:r>
               <w:t xml:space="preserve"> </w:t>
@@ -1476,13 +1619,16 @@
                 <w:b/>
                 <w:bCs/>
               </w:rPr>
-              <w:t xml:space="preserve">en memoria</w:t>
-            </w:r>
-            <w:r>
-              <w:t xml:space="preserve"> </w:t>
-            </w:r>
-            <w:r>
-              <w:t xml:space="preserve">y una base</w:t>
+              <w:t xml:space="preserve">en archivo o en servidor</w:t>
+            </w:r>
+            <w:r>
+              <w:t xml:space="preserve">. |</w:t>
+            </w:r>
+            <w:r>
+              <w:t xml:space="preserve"> </w:t>
+            </w:r>
+            <w:r>
+              <w:t xml:space="preserve">|</w:t>
             </w:r>
             <w:r>
               <w:t xml:space="preserve"> </w:t>
@@ -1492,34 +1638,25 @@
                 <w:b/>
                 <w:bCs/>
               </w:rPr>
-              <w:t xml:space="preserve">en archivo o en servidor</w:t>
-            </w:r>
-            <w:r>
-              <w:t xml:space="preserve">.</w:t>
-            </w:r>
-          </w:p>
-          <w:p>
-            <w:pPr>
-              <w:pStyle w:val="FirstParagraph"/>
-            </w:pPr>
-            <w:r>
-              <w:rPr>
-                <w:b/>
-                <w:bCs/>
-              </w:rPr>
               <w:t xml:space="preserve">Recursos:</w:t>
             </w:r>
-          </w:p>
-          <w:p>
-            <w:pPr>
-              <w:pStyle w:val="Compact"/>
-              <w:numPr>
-                <w:ilvl w:val="0"/>
-                <w:numId w:val="1004"/>
-              </w:numPr>
-            </w:pPr>
-            <w:r>
-              <w:t xml:space="preserve">Material HTML de la Semana 12 (hub</w:t>
+            <w:r>
+              <w:t xml:space="preserve"> </w:t>
+            </w:r>
+            <w:r>
+              <w:t xml:space="preserve">|</w:t>
+            </w:r>
+            <w:r>
+              <w:t xml:space="preserve"> </w:t>
+            </w:r>
+            <w:r>
+              <w:t xml:space="preserve">|</w:t>
+            </w:r>
+            <w:r>
+              <w:t xml:space="preserve"> </w:t>
+            </w:r>
+            <w:r>
+              <w:t xml:space="preserve">- Material HTML de la Semana 12 (hub</w:t>
             </w:r>
             <w:r>
               <w:t xml:space="preserve"> </w:t>
@@ -1534,7 +1671,7 @@
               <w:t xml:space="preserve"> </w:t>
             </w:r>
             <w:r>
-              <w:t xml:space="preserve">de la carpeta</w:t>
+              <w:t xml:space="preserve">de la carpeta |</w:t>
             </w:r>
             <w:r>
               <w:t xml:space="preserve"> </w:t>
@@ -1546,43 +1683,25 @@
               <w:t xml:space="preserve">Material_Sesion_Clase_12_HTML_18_semanas/</w:t>
             </w:r>
             <w:r>
-              <w:t xml:space="preserve">), incluido el</w:t>
-            </w:r>
-            <w:r>
-              <w:t xml:space="preserve"> </w:t>
-            </w:r>
-            <w:r>
-              <w:rPr>
-                <w:b/>
-                <w:bCs/>
-              </w:rPr>
-              <w:t xml:space="preserve">Kit de</w:t>
-            </w:r>
-            <w:r>
-              <w:rPr>
-                <w:b/>
-                <w:bCs/>
-              </w:rPr>
-              <w:t xml:space="preserve"> </w:t>
-            </w:r>
-            <w:r>
-              <w:rPr>
-                <w:b/>
-                <w:bCs/>
-              </w:rPr>
-              <w:t xml:space="preserve">archivos completos</w:t>
-            </w:r>
-            <w:r>
-              <w:t xml:space="preserve"> </w:t>
-            </w:r>
-            <w:r>
-              <w:t xml:space="preserve">con los doce archivos del módulo con</w:t>
-            </w:r>
-            <w:r>
-              <w:t xml:space="preserve"> </w:t>
-            </w:r>
-            <w:r>
-              <w:t xml:space="preserve">persistencia, cada uno con su ruta, su línea</w:t>
+              <w:t xml:space="preserve">), con seis pestañas de |</w:t>
+            </w:r>
+            <w:r>
+              <w:t xml:space="preserve"> </w:t>
+            </w:r>
+            <w:r>
+              <w:t xml:space="preserve">ejercicios: Ejercicios, Kit de Acompañamiento, explicación del Kit,|</w:t>
+            </w:r>
+            <w:r>
+              <w:t xml:space="preserve"> </w:t>
+            </w:r>
+            <w:r>
+              <w:t xml:space="preserve">Kit Jugador desde cero, Práctica independiente de Biblioteca y |</w:t>
+            </w:r>
+            <w:r>
+              <w:t xml:space="preserve"> </w:t>
+            </w:r>
+            <w:r>
+              <w:t xml:space="preserve">Anexo</w:t>
             </w:r>
             <w:r>
               <w:t xml:space="preserve"> </w:t>
@@ -1591,37 +1710,16 @@
               <w:rPr>
                 <w:rStyle w:val="VerbatimChar"/>
               </w:rPr>
-              <w:t xml:space="preserve">package</w:t>
-            </w:r>
-            <w:r>
-              <w:t xml:space="preserve"> </w:t>
-            </w:r>
-            <w:r>
-              <w:t xml:space="preserve">y todos sus</w:t>
-            </w:r>
-            <w:r>
-              <w:t xml:space="preserve"> </w:t>
-            </w:r>
-            <w:r>
-              <w:rPr>
-                <w:rStyle w:val="VerbatimChar"/>
-              </w:rPr>
-              <w:t xml:space="preserve">import</w:t>
-            </w:r>
-            <w:r>
-              <w:t xml:space="preserve">.</w:t>
-            </w:r>
-          </w:p>
-          <w:p>
-            <w:pPr>
-              <w:pStyle w:val="Compact"/>
-              <w:numPr>
-                <w:ilvl w:val="0"/>
-                <w:numId w:val="1004"/>
-              </w:numPr>
-            </w:pPr>
-            <w:r>
-              <w:t xml:space="preserve">Documentación de Spring Data JPA</w:t>
+              <w:t xml:space="preserve">taller-jpa</w:t>
+            </w:r>
+            <w:r>
+              <w:t xml:space="preserve">. |</w:t>
+            </w:r>
+            <w:r>
+              <w:t xml:space="preserve"> </w:t>
+            </w:r>
+            <w:r>
+              <w:t xml:space="preserve">- Documentación de Spring Data JPA |</w:t>
             </w:r>
             <w:r>
               <w:t xml:space="preserve"> </w:t>
@@ -1638,19 +1736,13 @@
               </w:r>
             </w:hyperlink>
             <w:r>
-              <w:t xml:space="preserve">).</w:t>
-            </w:r>
-          </w:p>
-          <w:p>
-            <w:pPr>
-              <w:pStyle w:val="Compact"/>
-              <w:numPr>
-                <w:ilvl w:val="0"/>
-                <w:numId w:val="1004"/>
-              </w:numPr>
-            </w:pPr>
-            <w:r>
-              <w:t xml:space="preserve">Documentación de Neon (</w:t>
+              <w:t xml:space="preserve">). |</w:t>
+            </w:r>
+            <w:r>
+              <w:t xml:space="preserve"> </w:t>
+            </w:r>
+            <w:r>
+              <w:t xml:space="preserve">- Documentación de Neon (</w:t>
             </w:r>
             <w:hyperlink r:id="rId23">
               <w:r>
@@ -1661,19 +1753,23 @@
               </w:r>
             </w:hyperlink>
             <w:r>
-              <w:t xml:space="preserve">), para anticipar</w:t>
-            </w:r>
-            <w:r>
-              <w:t xml:space="preserve"> </w:t>
-            </w:r>
-            <w:r>
-              <w:t xml:space="preserve">la Semana 14.</w:t>
-            </w:r>
-          </w:p>
-          <w:p>
-            <w:pPr>
-              <w:pStyle w:val="FirstParagraph"/>
-            </w:pPr>
+              <w:t xml:space="preserve">), para anticipar |</w:t>
+            </w:r>
+            <w:r>
+              <w:t xml:space="preserve"> </w:t>
+            </w:r>
+            <w:r>
+              <w:t xml:space="preserve">la Semana 14. |</w:t>
+            </w:r>
+            <w:r>
+              <w:t xml:space="preserve"> </w:t>
+            </w:r>
+            <w:r>
+              <w:t xml:space="preserve">|</w:t>
+            </w:r>
+            <w:r>
+              <w:t xml:space="preserve"> </w:t>
+            </w:r>
             <w:r>
               <w:rPr>
                 <w:b/>
@@ -1681,17 +1777,27 @@
               </w:rPr>
               <w:t xml:space="preserve">Evaluación (Formativa):</w:t>
             </w:r>
-          </w:p>
-          <w:p>
-            <w:pPr>
-              <w:pStyle w:val="BodyText"/>
-            </w:pPr>
+            <w:r>
+              <w:t xml:space="preserve"> </w:t>
+            </w:r>
+            <w:r>
+              <w:t xml:space="preserve">|</w:t>
+            </w:r>
+            <w:r>
+              <w:t xml:space="preserve"> </w:t>
+            </w:r>
+            <w:r>
+              <w:t xml:space="preserve">|</w:t>
+            </w:r>
+            <w:r>
+              <w:t xml:space="preserve"> </w:t>
+            </w:r>
             <w:r>
               <w:rPr>
                 <w:i/>
                 <w:iCs/>
               </w:rPr>
-              <w:t xml:space="preserve">Capacidad para explicar por qué los datos pueden seguir</w:t>
+              <w:t xml:space="preserve">Capacidad para explicar por qué los datos pueden seguir |</w:t>
             </w:r>
             <w:r>
               <w:rPr>
@@ -1705,7 +1811,7 @@
                 <w:i/>
                 <w:iCs/>
               </w:rPr>
-              <w:t xml:space="preserve">desapareciendo al reiniciar aunque la base ya esté configurada en</w:t>
+              <w:t xml:space="preserve">desapareciendo al reiniciar aunque la base ya esté configurada en |</w:t>
             </w:r>
             <w:r>
               <w:rPr>
@@ -1777,7 +1883,7 @@
                 <w:i/>
                 <w:iCs/>
               </w:rPr>
-              <w:t xml:space="preserve">en lugar del</w:t>
+              <w:t xml:space="preserve">en lugar del |</w:t>
             </w:r>
             <w:r>
               <w:rPr>
@@ -1792,6 +1898,12 @@
                 <w:iCs/>
               </w:rPr>
               <w:t xml:space="preserve">objeto directamente.</w:t>
+            </w:r>
+            <w:r>
+              <w:t xml:space="preserve"> </w:t>
+            </w:r>
+            <w:r>
+              <w:t xml:space="preserve">|</w:t>
             </w:r>
           </w:p>
         </w:tc>
@@ -1861,6 +1973,14 @@
             </w:r>
           </w:p>
         </w:tc>
+        <w:tc>
+          <w:tcPr/>
+          <w:p>
+            <w:pPr>
+              <w:pStyle w:val="Compact"/>
+            </w:pPr>
+          </w:p>
+        </w:tc>
       </w:tr>
     </w:tbl>
     <w:p>
@@ -1896,17 +2016,46 @@
         <w:t xml:space="preserve"> </w:t>
       </w:r>
       <w:r>
-        <w:t xml:space="preserve">real por una</w:t>
-      </w:r>
-      <w:r>
-        <w:t xml:space="preserve"> </w:t>
-      </w:r>
-      <w:r>
-        <w:rPr>
-          <w:b/>
-          <w:bCs/>
-        </w:rPr>
-        <w:t xml:space="preserve">base de datos</w:t>
+        <w:t xml:space="preserve">real —el mismo módulo de</w:t>
+      </w:r>
+      <w:r>
+        <w:t xml:space="preserve"> </w:t>
+      </w:r>
+      <w:r>
+        <w:rPr>
+          <w:rStyle w:val="VerbatimChar"/>
+        </w:rPr>
+        <w:t xml:space="preserve">Jugador</w:t>
+      </w:r>
+      <w:r>
+        <w:t xml:space="preserve"> </w:t>
+      </w:r>
+      <w:r>
+        <w:t xml:space="preserve">validado en la Semana 11— por una</w:t>
+      </w:r>
+      <w:r>
+        <w:t xml:space="preserve"> </w:t>
+      </w:r>
+      <w:r>
+        <w:rPr>
+          <w:b/>
+          <w:bCs/>
+        </w:rPr>
+        <w:t xml:space="preserve">base</w:t>
+      </w:r>
+      <w:r>
+        <w:rPr>
+          <w:b/>
+          <w:bCs/>
+        </w:rPr>
+        <w:t xml:space="preserve"> </w:t>
+      </w:r>
+      <w:r>
+        <w:rPr>
+          <w:b/>
+          <w:bCs/>
+        </w:rPr>
+        <w:t xml:space="preserve">de datos</w:t>
       </w:r>
       <w:r>
         <w:t xml:space="preserve">, de modo que la información de la institución</w:t>
@@ -1941,7 +2090,7 @@
         <w:pStyle w:val="Compact"/>
         <w:numPr>
           <w:ilvl w:val="0"/>
-          <w:numId w:val="1005"/>
+          <w:numId w:val="1001"/>
         </w:numPr>
       </w:pPr>
       <w:r>
@@ -1957,7 +2106,7 @@
         <w:pStyle w:val="Compact"/>
         <w:numPr>
           <w:ilvl w:val="1"/>
-          <w:numId w:val="1006"/>
+          <w:numId w:val="1002"/>
         </w:numPr>
       </w:pPr>
       <w:r>
@@ -1981,7 +2130,7 @@
         <w:pStyle w:val="Compact"/>
         <w:numPr>
           <w:ilvl w:val="1"/>
-          <w:numId w:val="1006"/>
+          <w:numId w:val="1002"/>
         </w:numPr>
       </w:pPr>
       <w:r>
@@ -1989,25 +2138,19 @@
           <w:b/>
           <w:bCs/>
         </w:rPr>
-        <w:t xml:space="preserve">Decidir primero, en palabras, cuál será la primera tabla:</w:t>
-      </w:r>
-      <w:r>
-        <w:t xml:space="preserve"> </w:t>
-      </w:r>
-      <w:r>
-        <w:t xml:space="preserve">qué</w:t>
-      </w:r>
-      <w:r>
-        <w:t xml:space="preserve"> </w:t>
-      </w:r>
-      <w:r>
-        <w:t xml:space="preserve">entidad de la institución se va a guardar, qué campos tiene y cuál</w:t>
-      </w:r>
-      <w:r>
-        <w:t xml:space="preserve"> </w:t>
-      </w:r>
-      <w:r>
-        <w:t xml:space="preserve">es el tipo de cada uno. La tabla de apoyo está al inicio de</w:t>
+        <w:t xml:space="preserve">Si la Semana 11 ya está completa, continúa desde ese proyecto:</w:t>
+      </w:r>
+      <w:r>
+        <w:t xml:space="preserve"> </w:t>
+      </w:r>
+      <w:r>
+        <w:t xml:space="preserve">no vuelvas a crear el formulario ni a escribir de nuevo sus</w:t>
+      </w:r>
+      <w:r>
+        <w:t xml:space="preserve"> </w:t>
+      </w:r>
+      <w:r>
+        <w:t xml:space="preserve">validaciones. Conserva</w:t>
       </w:r>
       <w:r>
         <w:t xml:space="preserve"> </w:t>
@@ -2016,10 +2159,70 @@
         <w:rPr>
           <w:rStyle w:val="VerbatimChar"/>
         </w:rPr>
-        <w:t xml:space="preserve">proyecto.html</w:t>
-      </w:r>
-      <w:r>
-        <w:t xml:space="preserve">.</w:t>
+        <w:t xml:space="preserve">Jugador</w:t>
+      </w:r>
+      <w:r>
+        <w:t xml:space="preserve">, sus plantillas, rutas y mensajes;</w:t>
+      </w:r>
+      <w:r>
+        <w:t xml:space="preserve"> </w:t>
+      </w:r>
+      <w:r>
+        <w:t xml:space="preserve">incorpora las piezas JPA y modifica únicamente el almacenamiento y</w:t>
+      </w:r>
+      <w:r>
+        <w:t xml:space="preserve"> </w:t>
+      </w:r>
+      <w:r>
+        <w:t xml:space="preserve">las acciones necesarias para editar y borrar. En el Kit, las marcas</w:t>
+      </w:r>
+      <w:r>
+        <w:t xml:space="preserve"> </w:t>
+      </w:r>
+      <w:r>
+        <w:t xml:space="preserve">“Ya viene de Semana 11”</w:t>
+      </w:r>
+      <w:r>
+        <w:t xml:space="preserve">,</w:t>
+      </w:r>
+      <w:r>
+        <w:t xml:space="preserve"> </w:t>
+      </w:r>
+      <w:r>
+        <w:t xml:space="preserve">“Se incorpora en Semana 12”</w:t>
+      </w:r>
+      <w:r>
+        <w:t xml:space="preserve">,</w:t>
+      </w:r>
+      <w:r>
+        <w:t xml:space="preserve"> </w:t>
+      </w:r>
+      <w:r>
+        <w:t xml:space="preserve">“Se modifica para usar JPA”</w:t>
+      </w:r>
+      <w:r>
+        <w:t xml:space="preserve"> </w:t>
+      </w:r>
+      <w:r>
+        <w:t xml:space="preserve">e</w:t>
+      </w:r>
+      <w:r>
+        <w:t xml:space="preserve"> </w:t>
+      </w:r>
+      <w:r>
+        <w:t xml:space="preserve">“Imprescindible”</w:t>
+      </w:r>
+      <w:r>
+        <w:t xml:space="preserve"> </w:t>
+      </w:r>
+      <w:r>
+        <w:t xml:space="preserve">distinguen cada tipo</w:t>
+      </w:r>
+      <w:r>
+        <w:t xml:space="preserve"> </w:t>
+      </w:r>
+      <w:r>
+        <w:t xml:space="preserve">de cambio.</w:t>
       </w:r>
     </w:p>
     <w:p>
@@ -2027,10 +2230,56 @@
         <w:pStyle w:val="Compact"/>
         <w:numPr>
           <w:ilvl w:val="1"/>
-          <w:numId w:val="1006"/>
+          <w:numId w:val="1002"/>
         </w:numPr>
       </w:pPr>
       <w:r>
+        <w:rPr>
+          <w:b/>
+          <w:bCs/>
+        </w:rPr>
+        <w:t xml:space="preserve">Decidir primero, en palabras, cuál será la primera tabla:</w:t>
+      </w:r>
+      <w:r>
+        <w:t xml:space="preserve"> </w:t>
+      </w:r>
+      <w:r>
+        <w:t xml:space="preserve">qué</w:t>
+      </w:r>
+      <w:r>
+        <w:t xml:space="preserve"> </w:t>
+      </w:r>
+      <w:r>
+        <w:t xml:space="preserve">entidad de la institución se va a guardar, qué campos tiene y cuál</w:t>
+      </w:r>
+      <w:r>
+        <w:t xml:space="preserve"> </w:t>
+      </w:r>
+      <w:r>
+        <w:t xml:space="preserve">es el tipo de cada uno. La tabla de apoyo está al inicio de</w:t>
+      </w:r>
+      <w:r>
+        <w:t xml:space="preserve"> </w:t>
+      </w:r>
+      <w:r>
+        <w:rPr>
+          <w:rStyle w:val="VerbatimChar"/>
+        </w:rPr>
+        <w:t xml:space="preserve">proyecto.html</w:t>
+      </w:r>
+      <w:r>
+        <w:t xml:space="preserve">.</w:t>
+      </w:r>
+    </w:p>
+    <w:p>
+      <w:pPr>
+        <w:pStyle w:val="Compact"/>
+        <w:numPr>
+          <w:ilvl w:val="1"/>
+          <w:numId w:val="1002"/>
+        </w:numPr>
+      </w:pPr>
+      <w:r>
         <w:t xml:space="preserve">Seguir la guía de ocho pasos incluida en</w:t>
       </w:r>
       <w:r>
@@ -2068,7 +2317,13 @@
         <w:t xml:space="preserve"> </w:t>
       </w:r>
       <w:r>
-        <w:t xml:space="preserve">aplicación sola tras cada cambio de código o plantilla, salvo en</w:t>
+        <w:t xml:space="preserve">aplicación cuando se recompila el código; los cambios de plantilla</w:t>
+      </w:r>
+      <w:r>
+        <w:t xml:space="preserve"> </w:t>
+      </w:r>
+      <w:r>
+        <w:t xml:space="preserve">solo requieren refrescar el navegador.</w:t>
       </w:r>
       <w:r>
         <w:t xml:space="preserve"> </w:t>
@@ -2083,7 +2338,7 @@
         <w:t xml:space="preserve"> </w:t>
       </w:r>
       <w:r>
-        <w:t xml:space="preserve">y en los</w:t>
+        <w:t xml:space="preserve">y los</w:t>
       </w:r>
       <w:r>
         <w:t xml:space="preserve"> </w:t>
@@ -2095,13 +2350,16 @@
         <w:t xml:space="preserve">application*.properties</w:t>
       </w:r>
       <w:r>
-        <w:t xml:space="preserve">, donde el reinicio</w:t>
-      </w:r>
-      <w:r>
-        <w:t xml:space="preserve"> </w:t>
-      </w:r>
-      <w:r>
-        <w:t xml:space="preserve">sigue siendo manual—, entidad, repositorio, servicio sin lista,</w:t>
+        <w:t xml:space="preserve"> </w:t>
+      </w:r>
+      <w:r>
+        <w:t xml:space="preserve">siguen requiriendo reinicio manual—,</w:t>
+      </w:r>
+      <w:r>
+        <w:t xml:space="preserve"> </w:t>
+      </w:r>
+      <w:r>
+        <w:t xml:space="preserve">entidad, repositorio, servicio sin lista,</w:t>
       </w:r>
       <w:r>
         <w:t xml:space="preserve"> </w:t>
@@ -2120,6 +2378,361 @@
       </w:r>
       <w:r>
         <w:t xml:space="preserve">segundo criterio, y publicación en GitHub.</w:t>
+      </w:r>
+    </w:p>
+    <w:p>
+      <w:pPr>
+        <w:pStyle w:val="Compact"/>
+        <w:numPr>
+          <w:ilvl w:val="1"/>
+          <w:numId w:val="1002"/>
+        </w:numPr>
+      </w:pPr>
+      <w:r>
+        <w:rPr>
+          <w:b/>
+          <w:bCs/>
+        </w:rPr>
+        <w:t xml:space="preserve">No omitir los requisitos nuevos de persistencia:</w:t>
+      </w:r>
+      <w:r>
+        <w:t xml:space="preserve"> </w:t>
+      </w:r>
+      <w:r>
+        <w:rPr>
+          <w:rStyle w:val="VerbatimChar"/>
+        </w:rPr>
+        <w:t xml:space="preserve">data-jpa</w:t>
+      </w:r>
+      <w:r>
+        <w:t xml:space="preserve"> </w:t>
+      </w:r>
+      <w:r>
+        <w:t xml:space="preserve">permite resolver los imports JPA y</w:t>
+      </w:r>
+      <w:r>
+        <w:t xml:space="preserve"> </w:t>
+      </w:r>
+      <w:r>
+        <w:rPr>
+          <w:rStyle w:val="VerbatimChar"/>
+        </w:rPr>
+        <w:t xml:space="preserve">JpaRepository</w:t>
+      </w:r>
+      <w:r>
+        <w:t xml:space="preserve">; si falta, esos</w:t>
+      </w:r>
+      <w:r>
+        <w:t xml:space="preserve"> </w:t>
+      </w:r>
+      <w:r>
+        <w:t xml:space="preserve">imports quedan sin resolver y no compila. H2 aporta el driver local;</w:t>
+      </w:r>
+      <w:r>
+        <w:t xml:space="preserve"> </w:t>
+      </w:r>
+      <w:r>
+        <w:t xml:space="preserve">si falta, la aplicación puede compilar pero falla al arrancar con</w:t>
+      </w:r>
+      <w:r>
+        <w:t xml:space="preserve"> </w:t>
+      </w:r>
+      <w:r>
+        <w:rPr>
+          <w:rStyle w:val="VerbatimChar"/>
+        </w:rPr>
+        <w:t xml:space="preserve">Failed to load driver class org.h2.Driver</w:t>
+      </w:r>
+      <w:r>
+        <w:t xml:space="preserve">. La entidad necesita</w:t>
+      </w:r>
+      <w:r>
+        <w:t xml:space="preserve"> </w:t>
+      </w:r>
+      <w:r>
+        <w:rPr>
+          <w:rStyle w:val="VerbatimChar"/>
+        </w:rPr>
+        <w:t xml:space="preserve">@Entity</w:t>
+      </w:r>
+      <w:r>
+        <w:t xml:space="preserve">,</w:t>
+      </w:r>
+      <w:r>
+        <w:t xml:space="preserve"> </w:t>
+      </w:r>
+      <w:r>
+        <w:rPr>
+          <w:rStyle w:val="VerbatimChar"/>
+        </w:rPr>
+        <w:t xml:space="preserve">@Id</w:t>
+      </w:r>
+      <w:r>
+        <w:t xml:space="preserve">, un id compatible con</w:t>
+      </w:r>
+      <w:r>
+        <w:t xml:space="preserve"> </w:t>
+      </w:r>
+      <w:r>
+        <w:rPr>
+          <w:rStyle w:val="VerbatimChar"/>
+        </w:rPr>
+        <w:t xml:space="preserve">JpaRepository</w:t>
+      </w:r>
+      <w:r>
+        <w:t xml:space="preserve"> </w:t>
+      </w:r>
+      <w:r>
+        <w:t xml:space="preserve">y constructor</w:t>
+      </w:r>
+      <w:r>
+        <w:t xml:space="preserve"> </w:t>
+      </w:r>
+      <w:r>
+        <w:t xml:space="preserve">vacío: sin</w:t>
+      </w:r>
+      <w:r>
+        <w:t xml:space="preserve"> </w:t>
+      </w:r>
+      <w:r>
+        <w:rPr>
+          <w:rStyle w:val="VerbatimChar"/>
+        </w:rPr>
+        <w:t xml:space="preserve">@Entity</w:t>
+      </w:r>
+      <w:r>
+        <w:t xml:space="preserve"> </w:t>
+      </w:r>
+      <w:r>
+        <w:t xml:space="preserve">puede aparecer</w:t>
+      </w:r>
+      <w:r>
+        <w:t xml:space="preserve"> </w:t>
+      </w:r>
+      <w:r>
+        <w:rPr>
+          <w:rStyle w:val="VerbatimChar"/>
+        </w:rPr>
+        <w:t xml:space="preserve">Not a managed type</w:t>
+      </w:r>
+      <w:r>
+        <w:t xml:space="preserve">, sin</w:t>
+      </w:r>
+      <w:r>
+        <w:t xml:space="preserve"> </w:t>
+      </w:r>
+      <w:r>
+        <w:rPr>
+          <w:rStyle w:val="VerbatimChar"/>
+        </w:rPr>
+        <w:t xml:space="preserve">@Id</w:t>
+      </w:r>
+      <w:r>
+        <w:t xml:space="preserve"> </w:t>
+      </w:r>
+      <w:r>
+        <w:t xml:space="preserve">aparece</w:t>
+      </w:r>
+      <w:r>
+        <w:t xml:space="preserve"> </w:t>
+      </w:r>
+      <w:r>
+        <w:rPr>
+          <w:rStyle w:val="VerbatimChar"/>
+        </w:rPr>
+        <w:t xml:space="preserve">No identifier specified for entity</w:t>
+      </w:r>
+      <w:r>
+        <w:t xml:space="preserve"> </w:t>
+      </w:r>
+      <w:r>
+        <w:t xml:space="preserve">y sin constructor</w:t>
+      </w:r>
+      <w:r>
+        <w:t xml:space="preserve"> </w:t>
+      </w:r>
+      <w:r>
+        <w:t xml:space="preserve">Hibernate no puede crear la entidad.</w:t>
+      </w:r>
+      <w:r>
+        <w:t xml:space="preserve"> </w:t>
+      </w:r>
+      <w:r>
+        <w:rPr>
+          <w:rStyle w:val="VerbatimChar"/>
+        </w:rPr>
+        <w:t xml:space="preserve">@GeneratedValue</w:t>
+      </w:r>
+      <w:r>
+        <w:t xml:space="preserve"> </w:t>
+      </w:r>
+      <w:r>
+        <w:t xml:space="preserve">permite que</w:t>
+      </w:r>
+      <w:r>
+        <w:t xml:space="preserve"> </w:t>
+      </w:r>
+      <w:r>
+        <w:t xml:space="preserve">la base genere el id; si no se configura, el estudiante tendría que</w:t>
+      </w:r>
+      <w:r>
+        <w:t xml:space="preserve"> </w:t>
+      </w:r>
+      <w:r>
+        <w:t xml:space="preserve">asignarlo manualmente. El repositorio debe quedar debajo del paquete</w:t>
+      </w:r>
+      <w:r>
+        <w:t xml:space="preserve"> </w:t>
+      </w:r>
+      <w:r>
+        <w:t xml:space="preserve">base para que Spring lo encuentre, y los nombres de sus métodos</w:t>
+      </w:r>
+      <w:r>
+        <w:t xml:space="preserve"> </w:t>
+      </w:r>
+      <w:r>
+        <w:t xml:space="preserve">derivados deben coincidir con campos reales; de lo contrario puede</w:t>
+      </w:r>
+      <w:r>
+        <w:t xml:space="preserve"> </w:t>
+      </w:r>
+      <w:r>
+        <w:t xml:space="preserve">fallar la inyección o aparecer</w:t>
+      </w:r>
+      <w:r>
+        <w:t xml:space="preserve"> </w:t>
+      </w:r>
+      <w:r>
+        <w:rPr>
+          <w:rStyle w:val="VerbatimChar"/>
+        </w:rPr>
+        <w:t xml:space="preserve">No property ... found for type</w:t>
+      </w:r>
+      <w:r>
+        <w:t xml:space="preserve">. En</w:t>
+      </w:r>
+      <w:r>
+        <w:t xml:space="preserve"> </w:t>
+      </w:r>
+      <w:r>
+        <w:t xml:space="preserve">Spring Boot 4, la consola requiere además su starter y la propiedad</w:t>
+      </w:r>
+      <w:r>
+        <w:t xml:space="preserve"> </w:t>
+      </w:r>
+      <w:r>
+        <w:t xml:space="preserve">que la habilita; sin esa configuración</w:t>
+      </w:r>
+      <w:r>
+        <w:t xml:space="preserve"> </w:t>
+      </w:r>
+      <w:r>
+        <w:rPr>
+          <w:rStyle w:val="VerbatimChar"/>
+        </w:rPr>
+        <w:t xml:space="preserve">/h2-console</w:t>
+      </w:r>
+      <w:r>
+        <w:t xml:space="preserve"> </w:t>
+      </w:r>
+      <w:r>
+        <w:t xml:space="preserve">responde 404.</w:t>
+      </w:r>
+      <w:r>
+        <w:t xml:space="preserve"> </w:t>
+      </w:r>
+      <w:r>
+        <w:t xml:space="preserve">Al editar, el formulario debe enviar el</w:t>
+      </w:r>
+      <w:r>
+        <w:t xml:space="preserve"> </w:t>
+      </w:r>
+      <w:r>
+        <w:rPr>
+          <w:rStyle w:val="VerbatimChar"/>
+        </w:rPr>
+        <w:t xml:space="preserve">id</w:t>
+      </w:r>
+      <w:r>
+        <w:t xml:space="preserve"> </w:t>
+      </w:r>
+      <w:r>
+        <w:t xml:space="preserve">oculto o se insertará</w:t>
+      </w:r>
+      <w:r>
+        <w:t xml:space="preserve"> </w:t>
+      </w:r>
+      <w:r>
+        <w:t xml:space="preserve">otra fila. Para conservar datos al reiniciar usa H2 en archivo con</w:t>
+      </w:r>
+      <w:r>
+        <w:t xml:space="preserve"> </w:t>
+      </w:r>
+      <w:r>
+        <w:rPr>
+          <w:rStyle w:val="VerbatimChar"/>
+        </w:rPr>
+        <w:t xml:space="preserve">ddl-auto=update</w:t>
+      </w:r>
+      <w:r>
+        <w:t xml:space="preserve">;</w:t>
+      </w:r>
+      <w:r>
+        <w:t xml:space="preserve"> </w:t>
+      </w:r>
+      <w:r>
+        <w:rPr>
+          <w:rStyle w:val="VerbatimChar"/>
+        </w:rPr>
+        <w:t xml:space="preserve">mem</w:t>
+      </w:r>
+      <w:r>
+        <w:t xml:space="preserve"> </w:t>
+      </w:r>
+      <w:r>
+        <w:t xml:space="preserve">es temporal y</w:t>
+      </w:r>
+      <w:r>
+        <w:t xml:space="preserve"> </w:t>
+      </w:r>
+      <w:r>
+        <w:rPr>
+          <w:rStyle w:val="VerbatimChar"/>
+        </w:rPr>
+        <w:t xml:space="preserve">ddl-auto=create</w:t>
+      </w:r>
+      <w:r>
+        <w:t xml:space="preserve"> </w:t>
+      </w:r>
+      <w:r>
+        <w:t xml:space="preserve">vuelve a</w:t>
+      </w:r>
+      <w:r>
+        <w:t xml:space="preserve"> </w:t>
+      </w:r>
+      <w:r>
+        <w:t xml:space="preserve">crear la tabla vacía. El driver PostgreSQL solo se necesita cuando</w:t>
+      </w:r>
+      <w:r>
+        <w:t xml:space="preserve"> </w:t>
+      </w:r>
+      <w:r>
+        <w:t xml:space="preserve">se activa el perfil</w:t>
+      </w:r>
+      <w:r>
+        <w:t xml:space="preserve"> </w:t>
+      </w:r>
+      <w:r>
+        <w:rPr>
+          <w:rStyle w:val="VerbatimChar"/>
+        </w:rPr>
+        <w:t xml:space="preserve">prod</w:t>
+      </w:r>
+      <w:r>
+        <w:t xml:space="preserve"> </w:t>
+      </w:r>
+      <w:r>
+        <w:t xml:space="preserve">que lo declara.</w:t>
       </w:r>
     </w:p>
     <w:p>
@@ -2127,7 +2740,7 @@
         <w:pStyle w:val="Compact"/>
         <w:numPr>
           <w:ilvl w:val="0"/>
-          <w:numId w:val="1005"/>
+          <w:numId w:val="1001"/>
         </w:numPr>
       </w:pPr>
       <w:r>
@@ -2193,7 +2806,7 @@
         <w:pStyle w:val="Compact"/>
         <w:numPr>
           <w:ilvl w:val="1"/>
-          <w:numId w:val="1007"/>
+          <w:numId w:val="1003"/>
         </w:numPr>
       </w:pPr>
       <w:r>
@@ -2221,7 +2834,7 @@
         <w:pStyle w:val="Compact"/>
         <w:numPr>
           <w:ilvl w:val="1"/>
-          <w:numId w:val="1007"/>
+          <w:numId w:val="1003"/>
         </w:numPr>
       </w:pPr>
       <w:r>
@@ -2282,7 +2895,7 @@
         <w:pStyle w:val="Compact"/>
         <w:numPr>
           <w:ilvl w:val="1"/>
-          <w:numId w:val="1007"/>
+          <w:numId w:val="1003"/>
         </w:numPr>
       </w:pPr>
       <w:r>
@@ -2316,7 +2929,7 @@
         <w:pStyle w:val="Compact"/>
         <w:numPr>
           <w:ilvl w:val="1"/>
-          <w:numId w:val="1007"/>
+          <w:numId w:val="1003"/>
         </w:numPr>
       </w:pPr>
       <w:r>
@@ -2375,7 +2988,7 @@
         <w:pStyle w:val="Compact"/>
         <w:numPr>
           <w:ilvl w:val="0"/>
-          <w:numId w:val="1005"/>
+          <w:numId w:val="1001"/>
         </w:numPr>
       </w:pPr>
       <w:r>
@@ -2391,7 +3004,7 @@
         <w:pStyle w:val="Compact"/>
         <w:numPr>
           <w:ilvl w:val="1"/>
-          <w:numId w:val="1008"/>
+          <w:numId w:val="1004"/>
         </w:numPr>
       </w:pPr>
       <w:r>
@@ -2419,7 +3032,7 @@
         <w:pStyle w:val="Compact"/>
         <w:numPr>
           <w:ilvl w:val="1"/>
-          <w:numId w:val="1008"/>
+          <w:numId w:val="1004"/>
         </w:numPr>
       </w:pPr>
       <w:r>
@@ -2484,7 +3097,13 @@
         <w:t xml:space="preserve"> </w:t>
       </w:r>
       <w:r>
-        <w:t xml:space="preserve">- Kit de archivos completos (</w:t>
+        <w:t xml:space="preserve">- Ejercicios progresivos de Jugador, Kit de Acompañamiento y explicación</w:t>
+      </w:r>
+      <w:r>
+        <w:t xml:space="preserve"> </w:t>
+      </w:r>
+      <w:r>
+        <w:t xml:space="preserve">(</w:t>
       </w:r>
       <w:r>
         <w:rPr>
@@ -2493,13 +3112,64 @@
         <w:t xml:space="preserve">ejercicios.html</w:t>
       </w:r>
       <w:r>
-        <w:t xml:space="preserve">, segunda pestaña) para</w:t>
-      </w:r>
-      <w:r>
-        <w:t xml:space="preserve"> </w:t>
-      </w:r>
-      <w:r>
-        <w:t xml:space="preserve">copiar cualquier archivo faltante, cambiando el paquete y la entidad.</w:t>
+        <w:t xml:space="preserve">, pestañas 1–3) para aplicar JPA sobre Semana 11 sin</w:t>
+      </w:r>
+      <w:r>
+        <w:t xml:space="preserve"> </w:t>
+      </w:r>
+      <w:r>
+        <w:t xml:space="preserve">rehacer las validaciones; Kit para iniciar Jugador desde cero (pestaña</w:t>
+      </w:r>
+      <w:r>
+        <w:t xml:space="preserve"> </w:t>
+      </w:r>
+      <w:r>
+        <w:t xml:space="preserve">4), generado desde Spring Initializr con las dependencias seleccionadas</w:t>
+      </w:r>
+      <w:r>
+        <w:t xml:space="preserve"> </w:t>
+      </w:r>
+      <w:r>
+        <w:t xml:space="preserve">en la página y siguiendo el árbol completo. Ambos Kits de Jugador</w:t>
+      </w:r>
+      <w:r>
+        <w:t xml:space="preserve"> </w:t>
+      </w:r>
+      <w:r>
+        <w:t xml:space="preserve">incluyen</w:t>
+      </w:r>
+      <w:r>
+        <w:t xml:space="preserve"> </w:t>
+      </w:r>
+      <w:r>
+        <w:rPr>
+          <w:rStyle w:val="VerbatimChar"/>
+        </w:rPr>
+        <w:t xml:space="preserve">error.html</w:t>
+      </w:r>
+      <w:r>
+        <w:t xml:space="preserve">. La Práctica independiente de Biblioteca y el</w:t>
+      </w:r>
+      <w:r>
+        <w:t xml:space="preserve"> </w:t>
+      </w:r>
+      <w:r>
+        <w:t xml:space="preserve">Anexo</w:t>
+      </w:r>
+      <w:r>
+        <w:t xml:space="preserve"> </w:t>
+      </w:r>
+      <w:r>
+        <w:rPr>
+          <w:rStyle w:val="VerbatimChar"/>
+        </w:rPr>
+        <w:t xml:space="preserve">taller-jpa</w:t>
+      </w:r>
+      <w:r>
+        <w:t xml:space="preserve"> </w:t>
+      </w:r>
+      <w:r>
+        <w:t xml:space="preserve">ocupan las pestañas 5 y 6.</w:t>
       </w:r>
       <w:r>
         <w:t xml:space="preserve"> </w:t>
@@ -3132,45 +3802,6 @@
     <w:abstractNumId w:val="991"/>
   </w:num>
   <w:num w:numId="1004">
-    <w:abstractNumId w:val="991"/>
-  </w:num>
-  <w:num w:numId="1005">
-    <w:abstractNumId w:val="99411"/>
-    <w:lvlOverride w:ilvl="0">
-      <w:startOverride w:val="1"/>
-    </w:lvlOverride>
-    <w:lvlOverride w:ilvl="1">
-      <w:startOverride w:val="1"/>
-    </w:lvlOverride>
-    <w:lvlOverride w:ilvl="2">
-      <w:startOverride w:val="1"/>
-    </w:lvlOverride>
-    <w:lvlOverride w:ilvl="3">
-      <w:startOverride w:val="1"/>
-    </w:lvlOverride>
-    <w:lvlOverride w:ilvl="4">
-      <w:startOverride w:val="1"/>
-    </w:lvlOverride>
-    <w:lvlOverride w:ilvl="5">
-      <w:startOverride w:val="1"/>
-    </w:lvlOverride>
-    <w:lvlOverride w:ilvl="6">
-      <w:startOverride w:val="1"/>
-    </w:lvlOverride>
-    <w:lvlOverride w:ilvl="7">
-      <w:startOverride w:val="1"/>
-    </w:lvlOverride>
-    <w:lvlOverride w:ilvl="8">
-      <w:startOverride w:val="1"/>
-    </w:lvlOverride>
-  </w:num>
-  <w:num w:numId="1006">
-    <w:abstractNumId w:val="991"/>
-  </w:num>
-  <w:num w:numId="1007">
-    <w:abstractNumId w:val="991"/>
-  </w:num>
-  <w:num w:numId="1008">
     <w:abstractNumId w:val="991"/>
   </w:num>
 </w:numbering>

</xml_diff>